<commit_message>
Fix contract DOCX: white background, print-friendly
https://claude.ai/code/session_01YA7cRLb11cnHtU7D5Kt8kT
</commit_message>
<xml_diff>
--- a/parlons-contrat-prestation.docx
+++ b/parlons-contrat-prestation.docx
@@ -3,25 +3,22 @@
 <w:document xmlns:wpc="http://schemas.microsoft.com/office/word/2010/wordprocessingCanvas" xmlns:mo="http://schemas.microsoft.com/office/mac/office/2008/main" xmlns:mc="http://schemas.openxmlformats.org/markup-compatibility/2006" xmlns:mv="urn:schemas-microsoft-com:mac:vml" xmlns:o="urn:schemas-microsoft-com:office:office" xmlns:r="http://schemas.openxmlformats.org/officeDocument/2006/relationships" xmlns:m="http://schemas.openxmlformats.org/officeDocument/2006/math" xmlns:v="urn:schemas-microsoft-com:vml" xmlns:wp14="http://schemas.microsoft.com/office/word/2010/wordprocessingDrawing" xmlns:wp="http://schemas.openxmlformats.org/drawingml/2006/wordprocessingDrawing" xmlns:w10="urn:schemas-microsoft-com:office:word" xmlns:w="http://schemas.openxmlformats.org/wordprocessingml/2006/main" xmlns:w14="http://schemas.microsoft.com/office/word/2010/wordml" xmlns:wpg="http://schemas.microsoft.com/office/word/2010/wordprocessingGroup" xmlns:wpi="http://schemas.microsoft.com/office/word/2010/wordprocessingInk" xmlns:wne="http://schemas.microsoft.com/office/word/2006/wordml" xmlns:wps="http://schemas.microsoft.com/office/word/2010/wordprocessingShape" mc:Ignorable="w14 wp14">
   <w:body>
     <w:p>
-      <w:pPr>
-        <w:jc w:val="left"/>
-      </w:pPr>
       <w:r>
         <w:rPr>
           <w:b/>
           <w:color w:val="C4714A"/>
-          <w:sz w:val="36"/>
+          <w:sz w:val="40"/>
         </w:rPr>
         <w:t>Parlons</w:t>
       </w:r>
     </w:p>
     <w:p>
       <w:pPr>
-        <w:spacing w:after="200"/>
+        <w:spacing w:after="240"/>
       </w:pPr>
       <w:r>
         <w:rPr>
-          <w:color w:val="B09070"/>
+          <w:color w:val="555555"/>
           <w:sz w:val="16"/>
         </w:rPr>
         <w:t>Contrat de Prestation de Services · Version 1.0 · Juin 2026</w:t>
@@ -29,13 +26,12 @@
     </w:p>
     <w:p>
       <w:pPr>
-        <w:spacing w:after="80"/>
         <w:jc w:val="center"/>
       </w:pPr>
       <w:r>
         <w:rPr>
           <w:b/>
-          <w:color w:val="2C1F14"/>
+          <w:color w:val="000000"/>
           <w:sz w:val="28"/>
         </w:rPr>
         <w:t>CONTRAT DE PRESTATION DE SERVICES</w:t>
@@ -48,7 +44,7 @@
       </w:pPr>
       <w:r>
         <w:rPr>
-          <w:color w:val="B09070"/>
+          <w:color w:val="555555"/>
           <w:sz w:val="18"/>
         </w:rPr>
         <w:t>Entre Parlons et l'Écoutant Prestataire</w:t>
@@ -56,22 +52,23 @@
     </w:p>
     <w:p>
       <w:pPr>
-        <w:jc w:val="left"/>
+        <w:pBdr>
+          <w:bottom w:val="single" w:sz="4" w:space="1" w:color="C4714A"/>
+        </w:pBdr>
       </w:pPr>
       <w:r>
         <w:rPr>
           <w:b/>
           <w:color w:val="C4714A"/>
-          <w:sz w:val="24"/>
+          <w:sz w:val="20"/>
         </w:rPr>
-        <w:t>Article 1 — Parties</w:t>
+        <w:t>ARTICLE 1 — PARTIES</w:t>
       </w:r>
     </w:p>
     <w:tbl>
       <w:tblPr>
         <w:tblStyle w:val="TableGrid"/>
         <w:tblW w:type="auto" w:w="0"/>
-        <w:jc w:val="center"/>
         <w:tblLook w:firstColumn="1" w:firstRow="1" w:lastColumn="0" w:lastRow="0" w:noHBand="0" w:noVBand="1" w:val="04A0"/>
       </w:tblPr>
       <w:tblGrid>
@@ -118,6 +115,7 @@
           <w:p>
             <w:r>
               <w:rPr>
+                <w:color w:val="000000"/>
                 <w:sz w:val="18"/>
               </w:rPr>
               <w:t>Marvin Lafeychine</w:t>
@@ -148,39 +146,10 @@
           <w:p>
             <w:r>
               <w:rPr>
+                <w:color w:val="000000"/>
                 <w:sz w:val="18"/>
               </w:rPr>
               <w:t>Fondateur — Parlons</w:t>
-            </w:r>
-          </w:p>
-        </w:tc>
-        <w:tc>
-          <w:tcPr>
-            <w:tcW w:type="dxa" w:w="4419"/>
-          </w:tcPr>
-          <w:p>
-            <w:r>
-              <w:rPr>
-                <w:sz w:val="18"/>
-              </w:rPr>
-              <w:t>Auto-entrepreneur</w:t>
-            </w:r>
-          </w:p>
-        </w:tc>
-      </w:tr>
-      <w:tr>
-        <w:tc>
-          <w:tcPr>
-            <w:tcW w:type="dxa" w:w="4419"/>
-          </w:tcPr>
-          <w:p>
-            <w:r>
-              <w:rPr>
-                <w:sz w:val="18"/>
-              </w:rPr>
-              <w:t>112 Route Bois de Lion</w:t>
-              <w:br/>
-              <w:t>33240 Peujard, France</w:t>
             </w:r>
           </w:p>
         </w:tc>
@@ -195,6 +164,8 @@
                 <w:color w:val="C4714A"/>
                 <w:sz w:val="18"/>
               </w:rPr>
+              <w:t>Auto-entrepreneur</w:t>
+              <w:br/>
               <w:t>SIRET : [NUMÉRO SIRET]</w:t>
               <w:br/>
               <w:t>Code APE : 9609Z</w:t>
@@ -210,9 +181,12 @@
           <w:p>
             <w:r>
               <w:rPr>
+                <w:color w:val="000000"/>
                 <w:sz w:val="18"/>
               </w:rPr>
-              <w:t>contact.parlons.ecoute@gmail.com</w:t>
+              <w:t>112 Route Bois de Lion</w:t>
+              <w:br/>
+              <w:t>33240 Peujard, France</w:t>
             </w:r>
           </w:p>
         </w:tc>
@@ -240,6 +214,36 @@
           <w:p>
             <w:r>
               <w:rPr>
+                <w:color w:val="000000"/>
+                <w:sz w:val="18"/>
+              </w:rPr>
+              <w:t>contact.parlons.ecoute@gmail.com</w:t>
+            </w:r>
+          </w:p>
+        </w:tc>
+        <w:tc>
+          <w:tcPr>
+            <w:tcW w:type="dxa" w:w="4419"/>
+          </w:tcPr>
+          <w:p>
+            <w:r>
+              <w:rPr>
+                <w:color w:val="000000"/>
+                <w:sz w:val="18"/>
+              </w:rPr>
+            </w:r>
+          </w:p>
+        </w:tc>
+      </w:tr>
+      <w:tr>
+        <w:tc>
+          <w:tcPr>
+            <w:tcW w:type="dxa" w:w="4419"/>
+          </w:tcPr>
+          <w:p>
+            <w:r>
+              <w:rPr>
+                <w:color w:val="000000"/>
                 <w:sz w:val="18"/>
               </w:rPr>
               <w:t>Ci-après dénommé « La Plateforme »</w:t>
@@ -253,6 +257,7 @@
           <w:p>
             <w:r>
               <w:rPr>
+                <w:color w:val="000000"/>
                 <w:sz w:val="18"/>
               </w:rPr>
               <w:t>Ci-après dénommé « l'Écoutant »</w:t>
@@ -260,41 +265,30 @@
           </w:p>
         </w:tc>
       </w:tr>
-      <w:tr>
-        <w:tc>
-          <w:tcPr>
-            <w:tcW w:type="dxa" w:w="4419"/>
-          </w:tcPr>
-          <w:p/>
-        </w:tc>
-        <w:tc>
-          <w:tcPr>
-            <w:tcW w:type="dxa" w:w="4419"/>
-          </w:tcPr>
-          <w:p/>
-        </w:tc>
-      </w:tr>
     </w:tbl>
     <w:p/>
     <w:p>
       <w:pPr>
-        <w:jc w:val="left"/>
+        <w:pBdr>
+          <w:bottom w:val="single" w:sz="4" w:space="1" w:color="C4714A"/>
+        </w:pBdr>
       </w:pPr>
       <w:r>
         <w:rPr>
           <w:b/>
           <w:color w:val="C4714A"/>
-          <w:sz w:val="24"/>
+          <w:sz w:val="20"/>
         </w:rPr>
-        <w:t>Article 2 — Objet</w:t>
+        <w:t>ARTICLE 2 — OBJET</w:t>
       </w:r>
     </w:p>
     <w:p>
       <w:pPr>
-        <w:spacing w:after="120"/>
+        <w:spacing w:after="100"/>
       </w:pPr>
       <w:r>
         <w:rPr>
+          <w:color w:val="000000"/>
           <w:sz w:val="20"/>
         </w:rPr>
         <w:t>Le présent contrat a pour objet de définir les conditions dans lesquelles l'Écoutant réalise des prestations d'écoute bienveillante conversationnelle pour le compte de Parlons, via la plateforme en ligne parlonsecoute.fr.</w:t>
@@ -302,10 +296,11 @@
     </w:p>
     <w:p>
       <w:pPr>
-        <w:spacing w:after="120"/>
+        <w:spacing w:after="100"/>
       </w:pPr>
       <w:r>
         <w:rPr>
+          <w:color w:val="000000"/>
           <w:sz w:val="20"/>
         </w:rPr>
         <w:t>Ces prestations consistent à accueillir, accompagner et écouter les utilisateurs de la plateforme lors de sessions individuelles ou de groupe, sans jamais se présenter comme professionnel de santé.</w:t>
@@ -313,23 +308,26 @@
     </w:p>
     <w:p>
       <w:pPr>
-        <w:jc w:val="left"/>
+        <w:pBdr>
+          <w:bottom w:val="single" w:sz="4" w:space="1" w:color="C4714A"/>
+        </w:pBdr>
       </w:pPr>
       <w:r>
         <w:rPr>
           <w:b/>
           <w:color w:val="C4714A"/>
-          <w:sz w:val="24"/>
+          <w:sz w:val="20"/>
         </w:rPr>
-        <w:t>Article 3 — Statut du Prestataire</w:t>
+        <w:t>ARTICLE 3 — STATUT DU PRESTATAIRE</w:t>
       </w:r>
     </w:p>
     <w:p>
       <w:pPr>
-        <w:spacing w:after="120"/>
+        <w:spacing w:after="100"/>
       </w:pPr>
       <w:r>
         <w:rPr>
+          <w:color w:val="000000"/>
           <w:sz w:val="20"/>
         </w:rPr>
         <w:t>L'Écoutant intervient en qualité de prestataire indépendant sous statut d'auto-entrepreneur. Il n'existe entre les parties aucun lien de subordination, aucun contrat de travail, ni aucune relation employeur-salarié.</w:t>
@@ -337,58 +335,65 @@
     </w:p>
     <w:p>
       <w:pPr>
-        <w:spacing w:after="120"/>
+        <w:spacing w:after="100"/>
       </w:pPr>
       <w:r>
         <w:rPr>
+          <w:color w:val="000000"/>
           <w:sz w:val="20"/>
         </w:rPr>
-        <w:t>L'Écoutant reste libre d'organiser son activité, ses horaires et ses conditions de travail. Il est seul responsable de ses obligations fiscales et sociales (déclarations URSSAF, TVA si applicable).</w:t>
+        <w:t>L'Écoutant reste libre d'organiser son activité, ses horaires et ses conditions de travail. Il est seul responsable de ses obligations fiscales et sociales.</w:t>
       </w:r>
     </w:p>
     <w:p>
       <w:pPr>
-        <w:jc w:val="left"/>
+        <w:pBdr>
+          <w:bottom w:val="single" w:sz="4" w:space="1" w:color="C4714A"/>
+        </w:pBdr>
       </w:pPr>
       <w:r>
         <w:rPr>
           <w:b/>
           <w:color w:val="C4714A"/>
-          <w:sz w:val="24"/>
+          <w:sz w:val="20"/>
         </w:rPr>
-        <w:t>Article 4 — Durée</w:t>
+        <w:t>ARTICLE 4 — DURÉE</w:t>
       </w:r>
     </w:p>
     <w:p>
       <w:pPr>
-        <w:spacing w:after="120"/>
+        <w:spacing w:after="100"/>
       </w:pPr>
       <w:r>
         <w:rPr>
+          <w:color w:val="000000"/>
           <w:sz w:val="20"/>
         </w:rPr>
-        <w:t>Le présent contrat est conclu pour une durée indéterminée à compter de sa signature. Il peut être résilié par l'une ou l'autre des parties conformément à l'Article 9.</w:t>
+        <w:t>Le présent contrat est conclu pour une durée indéterminée à compter de sa signature. Il peut être résilié conformément à l'Article 9.</w:t>
       </w:r>
     </w:p>
     <w:p>
       <w:pPr>
-        <w:jc w:val="left"/>
+        <w:pBdr>
+          <w:bottom w:val="single" w:sz="4" w:space="1" w:color="C4714A"/>
+        </w:pBdr>
       </w:pPr>
       <w:r>
         <w:rPr>
           <w:b/>
           <w:color w:val="C4714A"/>
-          <w:sz w:val="24"/>
+          <w:sz w:val="20"/>
         </w:rPr>
-        <w:t>Article 5 — Obligations de l'Écoutant</w:t>
+        <w:t>ARTICLE 5 — OBLIGATIONS DE L'ÉCOUTANT</w:t>
       </w:r>
     </w:p>
     <w:p>
       <w:pPr>
-        <w:spacing w:after="120"/>
+        <w:spacing w:after="100"/>
       </w:pPr>
       <w:r>
         <w:rPr>
+          <w:color w:val="000000"/>
           <w:sz w:val="20"/>
         </w:rPr>
         <w:t>L'Écoutant s'engage à :</w:t>
@@ -401,6 +406,7 @@
       </w:pPr>
       <w:r>
         <w:rPr>
+          <w:color w:val="000000"/>
           <w:sz w:val="20"/>
         </w:rPr>
         <w:t>Répondre aux sessions dans un délai de 2 minutes après attribution</w:t>
@@ -413,6 +419,7 @@
       </w:pPr>
       <w:r>
         <w:rPr>
+          <w:color w:val="000000"/>
           <w:sz w:val="20"/>
         </w:rPr>
         <w:t>Adopter une posture bienveillante, non-jugeante et confidentielle</w:t>
@@ -425,9 +432,10 @@
       </w:pPr>
       <w:r>
         <w:rPr>
+          <w:color w:val="000000"/>
           <w:sz w:val="20"/>
         </w:rPr>
-        <w:t>Ne jamais se présenter comme professionnel de santé (médecin, psychologue, thérapeute)</w:t>
+        <w:t>Ne jamais se présenter comme professionnel de santé</w:t>
       </w:r>
     </w:p>
     <w:p>
@@ -437,9 +445,10 @@
       </w:pPr>
       <w:r>
         <w:rPr>
+          <w:color w:val="000000"/>
           <w:sz w:val="20"/>
         </w:rPr>
-        <w:t>Orienter systématiquement vers le 3114 (prévention du suicide) en cas de risque vital</w:t>
+        <w:t>Orienter vers le 3114 (prévention du suicide) en cas de risque vital</w:t>
       </w:r>
     </w:p>
     <w:p>
@@ -449,9 +458,10 @@
       </w:pPr>
       <w:r>
         <w:rPr>
+          <w:color w:val="000000"/>
           <w:sz w:val="20"/>
         </w:rPr>
-        <w:t>Signaler immédiatement à Parlons toute situation de crise ou difficulté majeure</w:t>
+        <w:t>Signaler immédiatement toute situation de crise à Parlons</w:t>
       </w:r>
     </w:p>
     <w:p>
@@ -461,6 +471,7 @@
       </w:pPr>
       <w:r>
         <w:rPr>
+          <w:color w:val="000000"/>
           <w:sz w:val="20"/>
         </w:rPr>
         <w:t>Respecter le Protocole Interne Parlons en vigueur</w:t>
@@ -473,9 +484,10 @@
       </w:pPr>
       <w:r>
         <w:rPr>
+          <w:color w:val="000000"/>
           <w:sz w:val="20"/>
         </w:rPr>
-        <w:t>Maintenir la confidentialité absolue sur les échanges avec les utilisateurs</w:t>
+        <w:t>Maintenir la confidentialité absolue sur les échanges</w:t>
       </w:r>
     </w:p>
     <w:p>
@@ -485,6 +497,7 @@
       </w:pPr>
       <w:r>
         <w:rPr>
+          <w:color w:val="000000"/>
           <w:sz w:val="20"/>
         </w:rPr>
         <w:t>Émettre une facture mensuelle avant le 5 de chaque mois</w:t>
@@ -492,23 +505,26 @@
     </w:p>
     <w:p>
       <w:pPr>
-        <w:jc w:val="left"/>
+        <w:pBdr>
+          <w:bottom w:val="single" w:sz="4" w:space="1" w:color="C4714A"/>
+        </w:pBdr>
       </w:pPr>
       <w:r>
         <w:rPr>
           <w:b/>
           <w:color w:val="C4714A"/>
-          <w:sz w:val="24"/>
+          <w:sz w:val="20"/>
         </w:rPr>
-        <w:t>Article 6 — Obligations de Parlons</w:t>
+        <w:t>ARTICLE 6 — OBLIGATIONS DE PARLONS</w:t>
       </w:r>
     </w:p>
     <w:p>
       <w:pPr>
-        <w:spacing w:after="120"/>
+        <w:spacing w:after="100"/>
       </w:pPr>
       <w:r>
         <w:rPr>
+          <w:color w:val="000000"/>
           <w:sz w:val="20"/>
         </w:rPr>
         <w:t>Parlons s'engage à :</w:t>
@@ -521,9 +537,10 @@
       </w:pPr>
       <w:r>
         <w:rPr>
+          <w:color w:val="000000"/>
           <w:sz w:val="20"/>
         </w:rPr>
-        <w:t>Mettre à disposition de l'Écoutant l'accès à la plateforme technique</w:t>
+        <w:t>Mettre à disposition l'accès à la plateforme technique</w:t>
       </w:r>
     </w:p>
     <w:p>
@@ -533,6 +550,7 @@
       </w:pPr>
       <w:r>
         <w:rPr>
+          <w:color w:val="000000"/>
           <w:sz w:val="20"/>
         </w:rPr>
         <w:t>Régler les factures dans un délai de 10 jours ouvrés à réception</w:t>
@@ -545,6 +563,7 @@
       </w:pPr>
       <w:r>
         <w:rPr>
+          <w:color w:val="000000"/>
           <w:sz w:val="20"/>
         </w:rPr>
         <w:t>Informer l'Écoutant de toute modification des tarifs avec un préavis de 30 jours</w:t>
@@ -557,30 +576,34 @@
       </w:pPr>
       <w:r>
         <w:rPr>
+          <w:color w:val="000000"/>
           <w:sz w:val="20"/>
         </w:rPr>
-        <w:t>Fournir un support en cas de difficulté technique ou de situation de crise</w:t>
+        <w:t>Fournir un support en cas de difficulté technique ou de crise</w:t>
       </w:r>
     </w:p>
     <w:p>
       <w:pPr>
-        <w:jc w:val="left"/>
+        <w:pBdr>
+          <w:bottom w:val="single" w:sz="4" w:space="1" w:color="C4714A"/>
+        </w:pBdr>
       </w:pPr>
       <w:r>
         <w:rPr>
           <w:b/>
           <w:color w:val="C4714A"/>
-          <w:sz w:val="24"/>
+          <w:sz w:val="20"/>
         </w:rPr>
-        <w:t>Article 7 — Rémunération</w:t>
+        <w:t>ARTICLE 7 — RÉMUNÉRATION</w:t>
       </w:r>
     </w:p>
     <w:p>
       <w:pPr>
-        <w:spacing w:after="120"/>
+        <w:spacing w:after="100"/>
       </w:pPr>
       <w:r>
         <w:rPr>
+          <w:color w:val="000000"/>
           <w:sz w:val="20"/>
         </w:rPr>
         <w:t>L'Écoutant est rémunéré selon le barème suivant :</w:t>
@@ -605,6 +628,7 @@
             <w:r>
               <w:rPr>
                 <w:b/>
+                <w:color w:val="000000"/>
                 <w:sz w:val="18"/>
               </w:rPr>
               <w:t>Type de session</w:t>
@@ -619,6 +643,7 @@
             <w:r>
               <w:rPr>
                 <w:b/>
+                <w:color w:val="000000"/>
                 <w:sz w:val="18"/>
               </w:rPr>
               <w:t>Rémunération prestataire</w:t>
@@ -634,9 +659,10 @@
           <w:p>
             <w:r>
               <w:rPr>
+                <w:color w:val="000000"/>
                 <w:sz w:val="18"/>
               </w:rPr>
-              <w:t>Session individuelle 10 minutes</w:t>
+              <w:t>Session individuelle 10 min</w:t>
             </w:r>
           </w:p>
         </w:tc>
@@ -647,6 +673,7 @@
           <w:p>
             <w:r>
               <w:rPr>
+                <w:color w:val="000000"/>
                 <w:sz w:val="18"/>
               </w:rPr>
               <w:t>1,00 € HT</w:t>
@@ -662,9 +689,10 @@
           <w:p>
             <w:r>
               <w:rPr>
+                <w:color w:val="000000"/>
                 <w:sz w:val="18"/>
               </w:rPr>
-              <w:t>Session individuelle 30 minutes</w:t>
+              <w:t>Session individuelle 30 min</w:t>
             </w:r>
           </w:p>
         </w:tc>
@@ -675,6 +703,7 @@
           <w:p>
             <w:r>
               <w:rPr>
+                <w:color w:val="000000"/>
                 <w:sz w:val="18"/>
               </w:rPr>
               <w:t>3,50 € HT</w:t>
@@ -690,6 +719,7 @@
           <w:p>
             <w:r>
               <w:rPr>
+                <w:color w:val="000000"/>
                 <w:sz w:val="18"/>
               </w:rPr>
               <w:t>Session individuelle 1 heure</w:t>
@@ -703,6 +733,7 @@
           <w:p>
             <w:r>
               <w:rPr>
+                <w:color w:val="000000"/>
                 <w:sz w:val="18"/>
               </w:rPr>
               <w:t>7,50 € HT</w:t>
@@ -718,6 +749,7 @@
           <w:p>
             <w:r>
               <w:rPr>
+                <w:color w:val="000000"/>
                 <w:sz w:val="18"/>
               </w:rPr>
               <w:t>Pass mensuel illimité</w:t>
@@ -731,6 +763,7 @@
           <w:p>
             <w:r>
               <w:rPr>
+                <w:color w:val="000000"/>
                 <w:sz w:val="18"/>
               </w:rPr>
               <w:t>Part équitable entre agents actifs (≥ 10 sessions/mois)</w:t>
@@ -746,6 +779,7 @@
           <w:p>
             <w:r>
               <w:rPr>
+                <w:color w:val="000000"/>
                 <w:sz w:val="18"/>
               </w:rPr>
               <w:t>Chat de groupe</w:t>
@@ -759,6 +793,7 @@
           <w:p>
             <w:r>
               <w:rPr>
+                <w:color w:val="000000"/>
                 <w:sz w:val="18"/>
               </w:rPr>
               <w:t>Non rémunéré (participation libre)</w:t>
@@ -770,131 +805,122 @@
     <w:p/>
     <w:p>
       <w:pPr>
-        <w:spacing w:after="120"/>
+        <w:spacing w:after="100"/>
       </w:pPr>
       <w:r>
         <w:rPr>
+          <w:color w:val="000000"/>
           <w:sz w:val="20"/>
         </w:rPr>
-        <w:t>TVA non applicable — Article 293 B du CGI (auto-entrepreneur en franchise de base de TVA).</w:t>
+        <w:t>TVA non applicable — Article 293 B du CGI. Paiement par virement bancaire dans les 10 jours ouvrés suivant réception de la facture.</w:t>
       </w:r>
     </w:p>
     <w:p>
       <w:pPr>
-        <w:spacing w:after="120"/>
-      </w:pPr>
-      <w:r>
-        <w:rPr>
-          <w:sz w:val="20"/>
-        </w:rPr>
-        <w:t>Le paiement s'effectue par virement bancaire sur le RIB fourni par l'Écoutant, dans les 10 jours ouvrés suivant réception de la facture mensuelle.</w:t>
-      </w:r>
-    </w:p>
-    <w:p>
-      <w:pPr>
-        <w:jc w:val="left"/>
+        <w:pBdr>
+          <w:bottom w:val="single" w:sz="4" w:space="1" w:color="C4714A"/>
+        </w:pBdr>
       </w:pPr>
       <w:r>
         <w:rPr>
           <w:b/>
           <w:color w:val="C4714A"/>
-          <w:sz w:val="24"/>
+          <w:sz w:val="20"/>
         </w:rPr>
-        <w:t>Article 8 — Confidentialité</w:t>
+        <w:t>ARTICLE 8 — CONFIDENTIALITÉ</w:t>
       </w:r>
     </w:p>
     <w:p>
       <w:pPr>
-        <w:spacing w:after="120"/>
+        <w:spacing w:after="100"/>
       </w:pPr>
       <w:r>
         <w:rPr>
+          <w:color w:val="000000"/>
           <w:sz w:val="20"/>
         </w:rPr>
-        <w:t>L'Écoutant s'engage à maintenir strictement confidentielles toutes les informations relatives aux utilisateurs, aux sessions, aux données techniques et commerciales de Parlons, pendant toute la durée du contrat et après sa résiliation, sans limitation de durée.</w:t>
+        <w:t>L'Écoutant s'engage à maintenir strictement confidentielles toutes les informations relatives aux utilisateurs, sessions et données de Parlons, pendant et après la durée du contrat, sans limitation de durée.</w:t>
       </w:r>
     </w:p>
     <w:p>
       <w:pPr>
-        <w:spacing w:after="120"/>
-      </w:pPr>
-      <w:r>
-        <w:rPr>
-          <w:sz w:val="20"/>
-        </w:rPr>
-        <w:t>Toute violation de cette clause pourra donner lieu à des poursuites judiciaires.</w:t>
-      </w:r>
-    </w:p>
-    <w:p>
-      <w:pPr>
-        <w:jc w:val="left"/>
+        <w:pBdr>
+          <w:bottom w:val="single" w:sz="4" w:space="1" w:color="C4714A"/>
+        </w:pBdr>
       </w:pPr>
       <w:r>
         <w:rPr>
           <w:b/>
           <w:color w:val="C4714A"/>
-          <w:sz w:val="24"/>
+          <w:sz w:val="20"/>
         </w:rPr>
-        <w:t>Article 9 — Résiliation</w:t>
+        <w:t>ARTICLE 9 — RÉSILIATION</w:t>
       </w:r>
     </w:p>
     <w:p>
       <w:pPr>
-        <w:spacing w:after="120"/>
+        <w:spacing w:after="100"/>
       </w:pPr>
       <w:r>
         <w:rPr>
+          <w:color w:val="000000"/>
           <w:sz w:val="20"/>
         </w:rPr>
-        <w:t>Chacune des parties peut mettre fin au présent contrat par envoi d'un email avec accusé de réception, avec un préavis de 15 jours calendaires.</w:t>
+        <w:t>Chaque partie peut résilier le contrat par email avec accusé de réception, avec un préavis de 15 jours calendaires.</w:t>
       </w:r>
     </w:p>
     <w:p>
       <w:pPr>
-        <w:spacing w:after="120"/>
+        <w:spacing w:after="100"/>
       </w:pPr>
       <w:r>
         <w:rPr>
+          <w:color w:val="000000"/>
           <w:sz w:val="20"/>
         </w:rPr>
-        <w:t>Parlons se réserve le droit de résilier le contrat sans préavis en cas de manquement grave aux obligations de l'Écoutant (violation de confidentialité, comportement inapproprié envers un utilisateur, mise en danger d'un utilisateur).</w:t>
+        <w:t>Parlons peut résilier sans préavis en cas de manquement grave (violation de confidentialité, comportement inapproprié, mise en danger d'un utilisateur).</w:t>
       </w:r>
     </w:p>
     <w:p>
       <w:pPr>
-        <w:jc w:val="left"/>
+        <w:pBdr>
+          <w:bottom w:val="single" w:sz="4" w:space="1" w:color="C4714A"/>
+        </w:pBdr>
       </w:pPr>
       <w:r>
         <w:rPr>
           <w:b/>
           <w:color w:val="C4714A"/>
-          <w:sz w:val="24"/>
+          <w:sz w:val="20"/>
         </w:rPr>
-        <w:t>Article 10 — Droit applicable</w:t>
+        <w:t>ARTICLE 10 — DROIT APPLICABLE</w:t>
       </w:r>
     </w:p>
     <w:p>
       <w:pPr>
-        <w:spacing w:after="120"/>
+        <w:spacing w:after="100"/>
       </w:pPr>
       <w:r>
         <w:rPr>
+          <w:color w:val="000000"/>
           <w:sz w:val="20"/>
         </w:rPr>
-        <w:t>Le présent contrat est soumis au droit français. En cas de litige, les parties s'engagent à rechercher une solution amiable avant tout recours judiciaire. À défaut, le tribunal compétent sera celui du ressort du domicile de Parlons.</w:t>
+        <w:t>Le présent contrat est soumis au droit français. En cas de litige, les parties cherchent une solution amiable avant tout recours judiciaire.</w:t>
       </w:r>
     </w:p>
     <w:p>
       <w:pPr>
-        <w:jc w:val="left"/>
+        <w:pBdr>
+          <w:bottom w:val="single" w:sz="4" w:space="1" w:color="C4714A"/>
+        </w:pBdr>
       </w:pPr>
       <w:r>
         <w:rPr>
           <w:b/>
           <w:color w:val="C4714A"/>
-          <w:sz w:val="24"/>
+          <w:sz w:val="20"/>
         </w:rPr>
-        <w:t>Article 11 — Signatures</w:t>
+        <w:t>ARTICLE 11 — SIGNATURES</w:t>
       </w:r>
     </w:p>
     <w:p>
@@ -903,12 +929,14 @@
       </w:pPr>
       <w:r>
         <w:rPr>
+          <w:color w:val="000000"/>
           <w:sz w:val="20"/>
         </w:rPr>
         <w:t xml:space="preserve">Fait en deux exemplaires originaux, à </w:t>
       </w:r>
       <w:r>
         <w:rPr>
+          <w:color w:val="000000"/>
           <w:sz w:val="20"/>
           <w:u w:val="single"/>
         </w:rPr>
@@ -916,12 +944,14 @@
       </w:r>
       <w:r>
         <w:rPr>
+          <w:color w:val="000000"/>
           <w:sz w:val="20"/>
         </w:rPr>
         <w:t xml:space="preserve">, le </w:t>
       </w:r>
       <w:r>
         <w:rPr>
+          <w:color w:val="000000"/>
           <w:sz w:val="20"/>
           <w:u w:val="single"/>
         </w:rPr>
@@ -930,6 +960,7 @@
     </w:p>
     <w:tbl>
       <w:tblPr>
+        <w:tblStyle w:val="TableGrid"/>
         <w:tblW w:type="auto" w:w="0"/>
         <w:tblLook w:firstColumn="1" w:firstRow="1" w:lastColumn="0" w:lastRow="0" w:noHBand="0" w:noVBand="1" w:val="04A0"/>
       </w:tblPr>
@@ -964,7 +995,7 @@
                 <w:color w:val="C4714A"/>
                 <w:sz w:val="18"/>
               </w:rPr>
-              <w:t>Le Prestataire (Écoutant)</w:t>
+              <w:t>Le Prestataire (L'Écoutant)</w:t>
             </w:r>
           </w:p>
         </w:tc>
@@ -977,6 +1008,7 @@
           <w:p>
             <w:r>
               <w:rPr>
+                <w:color w:val="000000"/>
                 <w:sz w:val="18"/>
               </w:rPr>
               <w:t>Marvin Lafeychine</w:t>
@@ -1007,6 +1039,7 @@
           <w:p>
             <w:r>
               <w:rPr>
+                <w:color w:val="000000"/>
                 <w:sz w:val="18"/>
               </w:rPr>
               <w:t>Fondateur — Parlons</w:t>
@@ -1037,6 +1070,7 @@
           <w:p>
             <w:r>
               <w:rPr>
+                <w:color w:val="000000"/>
                 <w:sz w:val="18"/>
               </w:rPr>
               <w:br/>
@@ -1054,6 +1088,7 @@
           <w:p>
             <w:r>
               <w:rPr>
+                <w:color w:val="000000"/>
                 <w:sz w:val="18"/>
               </w:rPr>
               <w:br/>
@@ -1073,7 +1108,7 @@
           <w:p>
             <w:r>
               <w:rPr>
-                <w:color w:val="B09070"/>
+                <w:color w:val="555555"/>
                 <w:sz w:val="16"/>
               </w:rPr>
               <w:t>Signature précédée de « Lu et approuvé »</w:t>
@@ -1087,7 +1122,7 @@
           <w:p>
             <w:r>
               <w:rPr>
-                <w:color w:val="B09070"/>
+                <w:color w:val="555555"/>
                 <w:sz w:val="16"/>
               </w:rPr>
               <w:t>Signature précédée de « Lu et approuvé »</w:t>

</xml_diff>